<commit_message>
Live-tested tool trajectories: fixes, wastage checks, richer sample data
- Fix citations dropped when search already showed a short chunk in full
- Index section headings with each chunk (index format 2, rebuild once)
- Refuse identical repeated tool calls; read falls back to section on placeholder chunk_id
- Prompt: decide unsupported first, stop rule, grep/navigate guidance
- Trajectory tests: per-question call budgets, no repeats, no failed calls
- OpenAI/OpenRouter embedder for testing without Azure
- Richer sample data: 4 candidates, 3 job descriptions
- Notebook rebuilt (regenerates sample data with backup)

Co-Authored-By: Claude Sonnet 5.5 <noreply@anthropic.com>
Claude-Session: https://claude.ai/code/session_01PZQ3Rn3UDv9S8HGCp5cbAg
</commit_message>
<xml_diff>
--- a/data/candidates/candidate-001/cover-letter.docx
+++ b/data/candidates/candidate-001/cover-letter.docx
@@ -17,12 +17,22 @@
     </w:p>
     <w:p>
       <w:r>
-        <w:t>I am excited to apply for the Senior Python Engineer role on your Data Platform team. Over the last eight years I have built and operated data pipelines in production, and I enjoy turning messy operational data into reliable services other teams can build on.</w:t>
+        <w:t>I am applying for the Senior Python Engineer role on your Data Platform team. Over the last eight years I have built and operated data pipelines in production, and I enjoy turning messy operational data into reliable services that other teams can build on.</w:t>
       </w:r>
     </w:p>
     <w:p>
       <w:r>
-        <w:t>I am particularly drawn to your focus on data quality and to the mentoring responsibilities in the role. I have not worked with dbt, although I have built similar in-house transformation frameworks in Python and SQL.</w:t>
+        <w:t>At Northwind Analytics I lead a squad of four engineers. We replaced a fragile batch process with a streaming pipeline, introduced data contracts and brought the on-call load down to a level people can sustain. The part of the work I value most is mentoring: two of the engineers I coached were promoted last year.</w:t>
+      </w:r>
+    </w:p>
+    <w:p>
+      <w:r>
+        <w:t>What draws me to your team is the focus on data quality and the explicit mentoring responsibilities in the role. I should be transparent about two gaps. I have not worked with dbt, although I have built similar in-house transformation frameworks in Python and SQL. My Go experience is limited to side projects.</w:t>
+      </w:r>
+    </w:p>
+    <w:p>
+      <w:r>
+        <w:t>I am based in Lisbon, can work European hours, and could start after a two-month notice period. Thank you for considering my application.</w:t>
       </w:r>
     </w:p>
     <w:p>

</xml_diff>